<commit_message>
Update Group Project Proposal.docx
</commit_message>
<xml_diff>
--- a/TO DO/Group Project Proposal.docx
+++ b/TO DO/Group Project Proposal.docx
@@ -3897,6 +3897,9 @@
     </w:p>
     <w:p>
       <w:r>
+        <w:rPr>
+          <w:noProof/>
+        </w:rPr>
         <w:drawing>
           <wp:inline distT="0" distB="0" distL="0" distR="0" wp14:anchorId="4C231B93" wp14:editId="7705E5CD">
             <wp:extent cx="4614442" cy="6071191"/>
@@ -4742,6 +4745,837 @@
                 <w:lang w:eastAsia="en-AU"/>
               </w:rPr>
               <w:t>Final report and project documentation</w:t>
+            </w:r>
+          </w:p>
+        </w:tc>
+      </w:tr>
+    </w:tbl>
+    <w:p/>
+    <w:p>
+      <w:pPr>
+        <w:spacing w:after="160" w:line="259" w:lineRule="auto"/>
+      </w:pPr>
+      <w:r>
+        <w:br w:type="page"/>
+      </w:r>
+    </w:p>
+    <w:p>
+      <w:pPr>
+        <w:pStyle w:val="Heading1"/>
+      </w:pPr>
+      <w:r>
+        <w:lastRenderedPageBreak/>
+        <w:t>Delivery Roadmap</w:t>
+      </w:r>
+    </w:p>
+    <w:p>
+      <w:r>
+        <w:drawing>
+          <wp:anchor distT="0" distB="0" distL="114300" distR="114300" simplePos="0" relativeHeight="251659264" behindDoc="0" locked="0" layoutInCell="1" allowOverlap="1" wp14:anchorId="1F35AE15" wp14:editId="72B96A34">
+            <wp:simplePos x="0" y="0"/>
+            <wp:positionH relativeFrom="margin">
+              <wp:align>center</wp:align>
+            </wp:positionH>
+            <wp:positionV relativeFrom="paragraph">
+              <wp:posOffset>1293067</wp:posOffset>
+            </wp:positionV>
+            <wp:extent cx="6634480" cy="3380740"/>
+            <wp:effectExtent l="0" t="0" r="0" b="0"/>
+            <wp:wrapSquare wrapText="bothSides"/>
+            <wp:docPr id="1731100021" name="Picture 1"/>
+            <wp:cNvGraphicFramePr>
+              <a:graphicFrameLocks xmlns:a="http://schemas.openxmlformats.org/drawingml/2006/main" noChangeAspect="1"/>
+            </wp:cNvGraphicFramePr>
+            <a:graphic xmlns:a="http://schemas.openxmlformats.org/drawingml/2006/main">
+              <a:graphicData uri="http://schemas.openxmlformats.org/drawingml/2006/picture">
+                <pic:pic xmlns:pic="http://schemas.openxmlformats.org/drawingml/2006/picture">
+                  <pic:nvPicPr>
+                    <pic:cNvPr id="1731100021" name=""/>
+                    <pic:cNvPicPr/>
+                  </pic:nvPicPr>
+                  <pic:blipFill rotWithShape="1">
+                    <a:blip r:embed="rId8">
+                      <a:extLst>
+                        <a:ext uri="{28A0092B-C50C-407E-A947-70E740481C1C}">
+                          <a14:useLocalDpi xmlns:a14="http://schemas.microsoft.com/office/drawing/2010/main" val="0"/>
+                        </a:ext>
+                      </a:extLst>
+                    </a:blip>
+                    <a:srcRect l="1805" r="991"/>
+                    <a:stretch>
+                      <a:fillRect/>
+                    </a:stretch>
+                  </pic:blipFill>
+                  <pic:spPr bwMode="auto">
+                    <a:xfrm>
+                      <a:off x="0" y="0"/>
+                      <a:ext cx="6634480" cy="3380740"/>
+                    </a:xfrm>
+                    <a:prstGeom prst="rect">
+                      <a:avLst/>
+                    </a:prstGeom>
+                    <a:ln>
+                      <a:noFill/>
+                    </a:ln>
+                    <a:extLst>
+                      <a:ext uri="{53640926-AAD7-44D8-BBD7-CCE9431645EC}">
+                        <a14:shadowObscured xmlns:a14="http://schemas.microsoft.com/office/drawing/2010/main"/>
+                      </a:ext>
+                    </a:extLst>
+                  </pic:spPr>
+                </pic:pic>
+              </a:graphicData>
+            </a:graphic>
+            <wp14:sizeRelH relativeFrom="margin">
+              <wp14:pctWidth>0</wp14:pctWidth>
+            </wp14:sizeRelH>
+            <wp14:sizeRelV relativeFrom="margin">
+              <wp14:pctHeight>0</wp14:pctHeight>
+            </wp14:sizeRelV>
+          </wp:anchor>
+        </w:drawing>
+      </w:r>
+      <w:r>
+        <w:t>The delivery roadmap outlines the planned timeline for completing the major project milestones throughout the development of the AI-Based Smart Meal Planner. The roadmap provides a high-level schedule of project activities from project planning through to testing and final delivery, ensuring that development tasks are completed in a logical sequence and within the available project timeframe.</w:t>
+      </w:r>
+    </w:p>
+    <w:p>
+      <w:pPr>
+        <w:spacing w:after="160" w:line="259" w:lineRule="auto"/>
+      </w:pPr>
+      <w:r>
+        <w:br w:type="page"/>
+      </w:r>
+    </w:p>
+    <w:p>
+      <w:pPr>
+        <w:pStyle w:val="Heading1"/>
+      </w:pPr>
+      <w:r>
+        <w:lastRenderedPageBreak/>
+        <w:t>Risk Identification and Mitigation Plan</w:t>
+      </w:r>
+    </w:p>
+    <w:p>
+      <w:r>
+        <w:t>The successful delivery of the AI-Based Smart Meal Planner depends on identifying potential risks that may affect the project's scope, schedule, quality and overall success. The following risk management plan identifies key project risks, assesses their likelihood and impact, and outlines mitigation strategies to reduce their potential effect on project outcomes.</w:t>
+      </w:r>
+    </w:p>
+    <w:p/>
+    <w:tbl>
+      <w:tblPr>
+        <w:tblStyle w:val="TableGrid"/>
+        <w:tblW w:w="10490" w:type="dxa"/>
+        <w:tblInd w:w="-714" w:type="dxa"/>
+        <w:tblLook w:val="04A0" w:firstRow="1" w:lastRow="0" w:firstColumn="1" w:lastColumn="0" w:noHBand="0" w:noVBand="1"/>
+      </w:tblPr>
+      <w:tblGrid>
+        <w:gridCol w:w="848"/>
+        <w:gridCol w:w="3111"/>
+        <w:gridCol w:w="1161"/>
+        <w:gridCol w:w="992"/>
+        <w:gridCol w:w="4378"/>
+      </w:tblGrid>
+      <w:tr>
+        <w:tc>
+          <w:tcPr>
+            <w:tcW w:w="850" w:type="dxa"/>
+            <w:hideMark/>
+          </w:tcPr>
+          <w:p>
+            <w:pPr>
+              <w:jc w:val="center"/>
+              <w:rPr>
+                <w:b/>
+                <w:bCs/>
+                <w:lang w:eastAsia="en-AU"/>
+              </w:rPr>
+            </w:pPr>
+            <w:r>
+              <w:rPr>
+                <w:b/>
+                <w:bCs/>
+                <w:lang w:eastAsia="en-AU"/>
+              </w:rPr>
+              <w:t>Risk ID</w:t>
+            </w:r>
+          </w:p>
+        </w:tc>
+        <w:tc>
+          <w:tcPr>
+            <w:tcW w:w="3120" w:type="dxa"/>
+            <w:hideMark/>
+          </w:tcPr>
+          <w:p>
+            <w:pPr>
+              <w:jc w:val="center"/>
+              <w:rPr>
+                <w:b/>
+                <w:bCs/>
+                <w:lang w:eastAsia="en-AU"/>
+              </w:rPr>
+            </w:pPr>
+            <w:r>
+              <w:rPr>
+                <w:b/>
+                <w:bCs/>
+                <w:lang w:eastAsia="en-AU"/>
+              </w:rPr>
+              <w:t>Risk Description</w:t>
+            </w:r>
+          </w:p>
+        </w:tc>
+        <w:tc>
+          <w:tcPr>
+            <w:tcW w:w="1134" w:type="dxa"/>
+            <w:hideMark/>
+          </w:tcPr>
+          <w:p>
+            <w:pPr>
+              <w:jc w:val="center"/>
+              <w:rPr>
+                <w:b/>
+                <w:bCs/>
+                <w:lang w:eastAsia="en-AU"/>
+              </w:rPr>
+            </w:pPr>
+            <w:r>
+              <w:rPr>
+                <w:b/>
+                <w:bCs/>
+                <w:lang w:eastAsia="en-AU"/>
+              </w:rPr>
+              <w:t>Likelihood</w:t>
+            </w:r>
+          </w:p>
+        </w:tc>
+        <w:tc>
+          <w:tcPr>
+            <w:tcW w:w="992" w:type="dxa"/>
+            <w:hideMark/>
+          </w:tcPr>
+          <w:p>
+            <w:pPr>
+              <w:jc w:val="center"/>
+              <w:rPr>
+                <w:b/>
+                <w:bCs/>
+                <w:lang w:eastAsia="en-AU"/>
+              </w:rPr>
+            </w:pPr>
+            <w:r>
+              <w:rPr>
+                <w:b/>
+                <w:bCs/>
+                <w:lang w:eastAsia="en-AU"/>
+              </w:rPr>
+              <w:t>Impact</w:t>
+            </w:r>
+          </w:p>
+        </w:tc>
+        <w:tc>
+          <w:tcPr>
+            <w:tcW w:w="4394" w:type="dxa"/>
+            <w:hideMark/>
+          </w:tcPr>
+          <w:p>
+            <w:pPr>
+              <w:jc w:val="center"/>
+              <w:rPr>
+                <w:b/>
+                <w:bCs/>
+                <w:lang w:eastAsia="en-AU"/>
+              </w:rPr>
+            </w:pPr>
+            <w:r>
+              <w:rPr>
+                <w:b/>
+                <w:bCs/>
+                <w:lang w:eastAsia="en-AU"/>
+              </w:rPr>
+              <w:t>Mitigation Strategy</w:t>
+            </w:r>
+          </w:p>
+        </w:tc>
+      </w:tr>
+      <w:tr>
+        <w:tc>
+          <w:tcPr>
+            <w:tcW w:w="850" w:type="dxa"/>
+            <w:hideMark/>
+          </w:tcPr>
+          <w:p>
+            <w:pPr>
+              <w:rPr>
+                <w:lang w:eastAsia="en-AU"/>
+              </w:rPr>
+            </w:pPr>
+            <w:r>
+              <w:rPr>
+                <w:lang w:eastAsia="en-AU"/>
+              </w:rPr>
+              <w:t>R1</w:t>
+            </w:r>
+          </w:p>
+        </w:tc>
+        <w:tc>
+          <w:tcPr>
+            <w:tcW w:w="3120" w:type="dxa"/>
+            <w:hideMark/>
+          </w:tcPr>
+          <w:p>
+            <w:pPr>
+              <w:rPr>
+                <w:lang w:eastAsia="en-AU"/>
+              </w:rPr>
+            </w:pPr>
+            <w:r>
+              <w:rPr>
+                <w:lang w:eastAsia="en-AU"/>
+              </w:rPr>
+              <w:t>Team member availability or withdrawal may delay project progress.</w:t>
+            </w:r>
+          </w:p>
+        </w:tc>
+        <w:tc>
+          <w:tcPr>
+            <w:tcW w:w="1134" w:type="dxa"/>
+            <w:hideMark/>
+          </w:tcPr>
+          <w:p>
+            <w:pPr>
+              <w:rPr>
+                <w:lang w:eastAsia="en-AU"/>
+              </w:rPr>
+            </w:pPr>
+            <w:r>
+              <w:rPr>
+                <w:lang w:eastAsia="en-AU"/>
+              </w:rPr>
+              <w:t>Medium</w:t>
+            </w:r>
+          </w:p>
+        </w:tc>
+        <w:tc>
+          <w:tcPr>
+            <w:tcW w:w="992" w:type="dxa"/>
+            <w:hideMark/>
+          </w:tcPr>
+          <w:p>
+            <w:pPr>
+              <w:rPr>
+                <w:lang w:eastAsia="en-AU"/>
+              </w:rPr>
+            </w:pPr>
+            <w:r>
+              <w:rPr>
+                <w:lang w:eastAsia="en-AU"/>
+              </w:rPr>
+              <w:t>High</w:t>
+            </w:r>
+          </w:p>
+        </w:tc>
+        <w:tc>
+          <w:tcPr>
+            <w:tcW w:w="4394" w:type="dxa"/>
+            <w:hideMark/>
+          </w:tcPr>
+          <w:p>
+            <w:pPr>
+              <w:rPr>
+                <w:lang w:eastAsia="en-AU"/>
+              </w:rPr>
+            </w:pPr>
+            <w:r>
+              <w:rPr>
+                <w:lang w:eastAsia="en-AU"/>
+              </w:rPr>
+              <w:t>Maintain regular communication, document project progress and redistribute tasks when required.</w:t>
+            </w:r>
+          </w:p>
+        </w:tc>
+      </w:tr>
+      <w:tr>
+        <w:tc>
+          <w:tcPr>
+            <w:tcW w:w="850" w:type="dxa"/>
+            <w:hideMark/>
+          </w:tcPr>
+          <w:p>
+            <w:pPr>
+              <w:rPr>
+                <w:lang w:eastAsia="en-AU"/>
+              </w:rPr>
+            </w:pPr>
+            <w:r>
+              <w:rPr>
+                <w:lang w:eastAsia="en-AU"/>
+              </w:rPr>
+              <w:t>R2</w:t>
+            </w:r>
+          </w:p>
+        </w:tc>
+        <w:tc>
+          <w:tcPr>
+            <w:tcW w:w="3120" w:type="dxa"/>
+            <w:hideMark/>
+          </w:tcPr>
+          <w:p>
+            <w:pPr>
+              <w:rPr>
+                <w:lang w:eastAsia="en-AU"/>
+              </w:rPr>
+            </w:pPr>
+            <w:r>
+              <w:rPr>
+                <w:lang w:eastAsia="en-AU"/>
+              </w:rPr>
+              <w:t>Difficulty integrating the Generative AI API with the Android application.</w:t>
+            </w:r>
+          </w:p>
+        </w:tc>
+        <w:tc>
+          <w:tcPr>
+            <w:tcW w:w="1134" w:type="dxa"/>
+            <w:hideMark/>
+          </w:tcPr>
+          <w:p>
+            <w:pPr>
+              <w:rPr>
+                <w:lang w:eastAsia="en-AU"/>
+              </w:rPr>
+            </w:pPr>
+            <w:r>
+              <w:rPr>
+                <w:lang w:eastAsia="en-AU"/>
+              </w:rPr>
+              <w:t>Medium</w:t>
+            </w:r>
+          </w:p>
+        </w:tc>
+        <w:tc>
+          <w:tcPr>
+            <w:tcW w:w="992" w:type="dxa"/>
+            <w:hideMark/>
+          </w:tcPr>
+          <w:p>
+            <w:pPr>
+              <w:rPr>
+                <w:lang w:eastAsia="en-AU"/>
+              </w:rPr>
+            </w:pPr>
+            <w:r>
+              <w:rPr>
+                <w:lang w:eastAsia="en-AU"/>
+              </w:rPr>
+              <w:t>High</w:t>
+            </w:r>
+          </w:p>
+        </w:tc>
+        <w:tc>
+          <w:tcPr>
+            <w:tcW w:w="4394" w:type="dxa"/>
+            <w:hideMark/>
+          </w:tcPr>
+          <w:p>
+            <w:pPr>
+              <w:rPr>
+                <w:lang w:eastAsia="en-AU"/>
+              </w:rPr>
+            </w:pPr>
+            <w:r>
+              <w:rPr>
+                <w:lang w:eastAsia="en-AU"/>
+              </w:rPr>
+              <w:t>Prototype the API early, review documentation and allow additional time for troubleshooting and testing.</w:t>
+            </w:r>
+          </w:p>
+        </w:tc>
+      </w:tr>
+      <w:tr>
+        <w:tc>
+          <w:tcPr>
+            <w:tcW w:w="850" w:type="dxa"/>
+            <w:hideMark/>
+          </w:tcPr>
+          <w:p>
+            <w:pPr>
+              <w:rPr>
+                <w:lang w:eastAsia="en-AU"/>
+              </w:rPr>
+            </w:pPr>
+            <w:r>
+              <w:rPr>
+                <w:lang w:eastAsia="en-AU"/>
+              </w:rPr>
+              <w:t>R3</w:t>
+            </w:r>
+          </w:p>
+        </w:tc>
+        <w:tc>
+          <w:tcPr>
+            <w:tcW w:w="3120" w:type="dxa"/>
+            <w:hideMark/>
+          </w:tcPr>
+          <w:p>
+            <w:pPr>
+              <w:rPr>
+                <w:lang w:eastAsia="en-AU"/>
+              </w:rPr>
+            </w:pPr>
+            <w:r>
+              <w:rPr>
+                <w:lang w:eastAsia="en-AU"/>
+              </w:rPr>
+              <w:t>AI-generated responses may be inaccurate, inconsistent or fail to satisfy user requirements.</w:t>
+            </w:r>
+          </w:p>
+        </w:tc>
+        <w:tc>
+          <w:tcPr>
+            <w:tcW w:w="1134" w:type="dxa"/>
+            <w:hideMark/>
+          </w:tcPr>
+          <w:p>
+            <w:pPr>
+              <w:rPr>
+                <w:lang w:eastAsia="en-AU"/>
+              </w:rPr>
+            </w:pPr>
+            <w:r>
+              <w:rPr>
+                <w:lang w:eastAsia="en-AU"/>
+              </w:rPr>
+              <w:t>Medium</w:t>
+            </w:r>
+          </w:p>
+        </w:tc>
+        <w:tc>
+          <w:tcPr>
+            <w:tcW w:w="992" w:type="dxa"/>
+            <w:hideMark/>
+          </w:tcPr>
+          <w:p>
+            <w:pPr>
+              <w:rPr>
+                <w:lang w:eastAsia="en-AU"/>
+              </w:rPr>
+            </w:pPr>
+            <w:r>
+              <w:rPr>
+                <w:lang w:eastAsia="en-AU"/>
+              </w:rPr>
+              <w:t>Medium</w:t>
+            </w:r>
+          </w:p>
+        </w:tc>
+        <w:tc>
+          <w:tcPr>
+            <w:tcW w:w="4394" w:type="dxa"/>
+            <w:hideMark/>
+          </w:tcPr>
+          <w:p>
+            <w:pPr>
+              <w:rPr>
+                <w:lang w:eastAsia="en-AU"/>
+              </w:rPr>
+            </w:pPr>
+            <w:r>
+              <w:rPr>
+                <w:lang w:eastAsia="en-AU"/>
+              </w:rPr>
+              <w:t>Validate AI responses, refine prompts and provide users with the ability to regenerate results.</w:t>
+            </w:r>
+          </w:p>
+        </w:tc>
+      </w:tr>
+      <w:tr>
+        <w:tc>
+          <w:tcPr>
+            <w:tcW w:w="850" w:type="dxa"/>
+            <w:hideMark/>
+          </w:tcPr>
+          <w:p>
+            <w:pPr>
+              <w:rPr>
+                <w:lang w:eastAsia="en-AU"/>
+              </w:rPr>
+            </w:pPr>
+            <w:r>
+              <w:rPr>
+                <w:lang w:eastAsia="en-AU"/>
+              </w:rPr>
+              <w:t>R4</w:t>
+            </w:r>
+          </w:p>
+        </w:tc>
+        <w:tc>
+          <w:tcPr>
+            <w:tcW w:w="3120" w:type="dxa"/>
+            <w:hideMark/>
+          </w:tcPr>
+          <w:p>
+            <w:pPr>
+              <w:rPr>
+                <w:lang w:eastAsia="en-AU"/>
+              </w:rPr>
+            </w:pPr>
+            <w:r>
+              <w:rPr>
+                <w:lang w:eastAsia="en-AU"/>
+              </w:rPr>
+              <w:t>Development tasks require more time than originally estimated.</w:t>
+            </w:r>
+          </w:p>
+        </w:tc>
+        <w:tc>
+          <w:tcPr>
+            <w:tcW w:w="1134" w:type="dxa"/>
+            <w:hideMark/>
+          </w:tcPr>
+          <w:p>
+            <w:pPr>
+              <w:rPr>
+                <w:lang w:eastAsia="en-AU"/>
+              </w:rPr>
+            </w:pPr>
+            <w:r>
+              <w:rPr>
+                <w:lang w:eastAsia="en-AU"/>
+              </w:rPr>
+              <w:t>Medium</w:t>
+            </w:r>
+          </w:p>
+        </w:tc>
+        <w:tc>
+          <w:tcPr>
+            <w:tcW w:w="992" w:type="dxa"/>
+            <w:hideMark/>
+          </w:tcPr>
+          <w:p>
+            <w:pPr>
+              <w:rPr>
+                <w:lang w:eastAsia="en-AU"/>
+              </w:rPr>
+            </w:pPr>
+            <w:r>
+              <w:rPr>
+                <w:lang w:eastAsia="en-AU"/>
+              </w:rPr>
+              <w:t>Medium</w:t>
+            </w:r>
+          </w:p>
+        </w:tc>
+        <w:tc>
+          <w:tcPr>
+            <w:tcW w:w="4394" w:type="dxa"/>
+            <w:hideMark/>
+          </w:tcPr>
+          <w:p>
+            <w:pPr>
+              <w:rPr>
+                <w:lang w:eastAsia="en-AU"/>
+              </w:rPr>
+            </w:pPr>
+            <w:r>
+              <w:rPr>
+                <w:lang w:eastAsia="en-AU"/>
+              </w:rPr>
+              <w:t>Monitor progress regularly, prioritise essential features and adjust the schedule where necessary.</w:t>
+            </w:r>
+          </w:p>
+        </w:tc>
+      </w:tr>
+      <w:tr>
+        <w:tc>
+          <w:tcPr>
+            <w:tcW w:w="850" w:type="dxa"/>
+            <w:hideMark/>
+          </w:tcPr>
+          <w:p>
+            <w:pPr>
+              <w:rPr>
+                <w:lang w:eastAsia="en-AU"/>
+              </w:rPr>
+            </w:pPr>
+            <w:r>
+              <w:rPr>
+                <w:lang w:eastAsia="en-AU"/>
+              </w:rPr>
+              <w:t>R5</w:t>
+            </w:r>
+          </w:p>
+        </w:tc>
+        <w:tc>
+          <w:tcPr>
+            <w:tcW w:w="3120" w:type="dxa"/>
+            <w:hideMark/>
+          </w:tcPr>
+          <w:p>
+            <w:pPr>
+              <w:rPr>
+                <w:lang w:eastAsia="en-AU"/>
+              </w:rPr>
+            </w:pPr>
+            <w:r>
+              <w:rPr>
+                <w:lang w:eastAsia="en-AU"/>
+              </w:rPr>
+              <w:t>Technical issues with Android Studio, development tools or third-party services delay development.</w:t>
+            </w:r>
+          </w:p>
+        </w:tc>
+        <w:tc>
+          <w:tcPr>
+            <w:tcW w:w="1134" w:type="dxa"/>
+            <w:hideMark/>
+          </w:tcPr>
+          <w:p>
+            <w:pPr>
+              <w:rPr>
+                <w:lang w:eastAsia="en-AU"/>
+              </w:rPr>
+            </w:pPr>
+            <w:r>
+              <w:rPr>
+                <w:lang w:eastAsia="en-AU"/>
+              </w:rPr>
+              <w:t>Low</w:t>
+            </w:r>
+          </w:p>
+        </w:tc>
+        <w:tc>
+          <w:tcPr>
+            <w:tcW w:w="992" w:type="dxa"/>
+            <w:hideMark/>
+          </w:tcPr>
+          <w:p>
+            <w:pPr>
+              <w:rPr>
+                <w:lang w:eastAsia="en-AU"/>
+              </w:rPr>
+            </w:pPr>
+            <w:r>
+              <w:rPr>
+                <w:lang w:eastAsia="en-AU"/>
+              </w:rPr>
+              <w:t>Medium</w:t>
+            </w:r>
+          </w:p>
+        </w:tc>
+        <w:tc>
+          <w:tcPr>
+            <w:tcW w:w="4394" w:type="dxa"/>
+            <w:hideMark/>
+          </w:tcPr>
+          <w:p>
+            <w:pPr>
+              <w:rPr>
+                <w:lang w:eastAsia="en-AU"/>
+              </w:rPr>
+            </w:pPr>
+            <w:r>
+              <w:rPr>
+                <w:lang w:eastAsia="en-AU"/>
+              </w:rPr>
+              <w:t>Maintain backups, keep development tools updated and identify alternative solutions where possible.</w:t>
+            </w:r>
+          </w:p>
+        </w:tc>
+      </w:tr>
+      <w:tr>
+        <w:tc>
+          <w:tcPr>
+            <w:tcW w:w="850" w:type="dxa"/>
+            <w:hideMark/>
+          </w:tcPr>
+          <w:p>
+            <w:pPr>
+              <w:rPr>
+                <w:lang w:eastAsia="en-AU"/>
+              </w:rPr>
+            </w:pPr>
+            <w:r>
+              <w:rPr>
+                <w:lang w:eastAsia="en-AU"/>
+              </w:rPr>
+              <w:t>R6</w:t>
+            </w:r>
+          </w:p>
+        </w:tc>
+        <w:tc>
+          <w:tcPr>
+            <w:tcW w:w="3120" w:type="dxa"/>
+            <w:hideMark/>
+          </w:tcPr>
+          <w:p>
+            <w:pPr>
+              <w:rPr>
+                <w:lang w:eastAsia="en-AU"/>
+              </w:rPr>
+            </w:pPr>
+            <w:r>
+              <w:rPr>
+                <w:lang w:eastAsia="en-AU"/>
+              </w:rPr>
+              <w:t>Insufficient testing results in application defects before submission.</w:t>
+            </w:r>
+          </w:p>
+        </w:tc>
+        <w:tc>
+          <w:tcPr>
+            <w:tcW w:w="1134" w:type="dxa"/>
+            <w:hideMark/>
+          </w:tcPr>
+          <w:p>
+            <w:pPr>
+              <w:rPr>
+                <w:lang w:eastAsia="en-AU"/>
+              </w:rPr>
+            </w:pPr>
+            <w:r>
+              <w:rPr>
+                <w:lang w:eastAsia="en-AU"/>
+              </w:rPr>
+              <w:t>Medium</w:t>
+            </w:r>
+          </w:p>
+        </w:tc>
+        <w:tc>
+          <w:tcPr>
+            <w:tcW w:w="992" w:type="dxa"/>
+            <w:hideMark/>
+          </w:tcPr>
+          <w:p>
+            <w:pPr>
+              <w:rPr>
+                <w:lang w:eastAsia="en-AU"/>
+              </w:rPr>
+            </w:pPr>
+            <w:r>
+              <w:rPr>
+                <w:lang w:eastAsia="en-AU"/>
+              </w:rPr>
+              <w:t>High</w:t>
+            </w:r>
+          </w:p>
+        </w:tc>
+        <w:tc>
+          <w:tcPr>
+            <w:tcW w:w="4394" w:type="dxa"/>
+            <w:hideMark/>
+          </w:tcPr>
+          <w:p>
+            <w:pPr>
+              <w:rPr>
+                <w:lang w:eastAsia="en-AU"/>
+              </w:rPr>
+            </w:pPr>
+            <w:r>
+              <w:rPr>
+                <w:lang w:eastAsia="en-AU"/>
+              </w:rPr>
+              <w:t>Conduct regular testing throughout development and perform integration testing before final submission.</w:t>
             </w:r>
           </w:p>
         </w:tc>

</xml_diff>

<commit_message>
Profile Ingredients Screen UI
</commit_message>
<xml_diff>
--- a/TO DO/Group Project Proposal.docx
+++ b/TO DO/Group Project Proposal.docx
@@ -13000,7 +13000,7 @@
                 <w:szCs w:val="20"/>
                 <w:lang w:eastAsia="en-AU"/>
               </w:rPr>
-              <w:t>Multi-select chips</w:t>
+              <w:t>Multi-selection control</w:t>
             </w:r>
           </w:p>
         </w:tc>
@@ -13110,7 +13110,16 @@
                 <w:szCs w:val="20"/>
                 <w:lang w:eastAsia="en-AU"/>
               </w:rPr>
-              <w:t>Multi-select chips / text input</w:t>
+              <w:t>Multi-selection control</w:t>
+            </w:r>
+            <w:r>
+              <w:rPr>
+                <w:rFonts w:cs="Calibri"/>
+                <w:sz w:val="20"/>
+                <w:szCs w:val="20"/>
+                <w:lang w:eastAsia="en-AU"/>
+              </w:rPr>
+              <w:t>/ text input</w:t>
             </w:r>
           </w:p>
         </w:tc>
@@ -13350,7 +13359,13 @@
     </w:p>
     <w:p>
       <w:r>
-        <w:t>The Home screen provides users with an overview of their current meal plan and nutritional information while providing access to the application's primary functions. A daily nutrition summary displays the user's protein, carbohydrate, fat and calorie intake against their daily targets. The Today's Meals section displays the meals scheduled for the current day and allows the user to view the details of each meal.</w:t>
+        <w:t xml:space="preserve">The Home screen provides users with an overview of their current meal plan and nutritional information while providing access to the application's primary functions. </w:t>
+      </w:r>
+      <w:r>
+        <w:t>A daily nutrition summary displays the protein, carbohydrate, fat and calorie information associated with the user's planned meals against their daily nutritional targets</w:t>
+      </w:r>
+      <w:r>
+        <w:t>. The Today's Meals section displays the meals scheduled for the current day and allows the user to view the details of each meal.</w:t>
       </w:r>
     </w:p>
     <w:p>
@@ -13365,9 +13380,9 @@
           <w14:ligatures w14:val="standardContextual"/>
         </w:rPr>
         <w:drawing>
-          <wp:inline distT="0" distB="0" distL="0" distR="0" wp14:anchorId="128B0001" wp14:editId="0461006F">
-            <wp:extent cx="2389765" cy="5177642"/>
-            <wp:effectExtent l="0" t="0" r="0" b="4445"/>
+          <wp:inline distT="0" distB="0" distL="0" distR="0" wp14:anchorId="128B0001" wp14:editId="1A60F676">
+            <wp:extent cx="2612571" cy="5660372"/>
+            <wp:effectExtent l="0" t="0" r="0" b="0"/>
             <wp:docPr id="1893998213" name="Picture 2"/>
             <wp:cNvGraphicFramePr>
               <a:graphicFrameLocks xmlns:a="http://schemas.openxmlformats.org/drawingml/2006/main" noChangeAspect="1"/>
@@ -13397,7 +13412,7 @@
                   <pic:spPr bwMode="auto">
                     <a:xfrm>
                       <a:off x="0" y="0"/>
-                      <a:ext cx="2393622" cy="5185999"/>
+                      <a:ext cx="2619261" cy="5674866"/>
                     </a:xfrm>
                     <a:prstGeom prst="rect">
                       <a:avLst/>
@@ -13451,20 +13466,16 @@
     </w:p>
     <w:p>
       <w:pPr>
-        <w:rPr>
-          <w:rFonts w:asciiTheme="majorHAnsi" w:hAnsiTheme="majorHAnsi"/>
-          <w:sz w:val="32"/>
-          <w:szCs w:val="32"/>
-        </w:rPr>
+        <w:pStyle w:val="Heading4"/>
       </w:pPr>
       <w:r>
         <w:rPr>
           <w:noProof/>
         </w:rPr>
         <w:drawing>
-          <wp:inline distT="0" distB="0" distL="0" distR="0" wp14:anchorId="13DF5CD7" wp14:editId="7AF95A46">
-            <wp:extent cx="2363476" cy="5118265"/>
-            <wp:effectExtent l="0" t="0" r="0" b="6350"/>
+          <wp:inline distT="0" distB="0" distL="0" distR="0" wp14:anchorId="13DF5CD7" wp14:editId="2BA5D4AF">
+            <wp:extent cx="2731325" cy="5914869"/>
+            <wp:effectExtent l="0" t="0" r="0" b="0"/>
             <wp:docPr id="2108212074" name="Picture 1"/>
             <wp:cNvGraphicFramePr>
               <a:graphicFrameLocks xmlns:a="http://schemas.openxmlformats.org/drawingml/2006/main" noChangeAspect="1"/>
@@ -13494,7 +13505,7 @@
                   <pic:spPr bwMode="auto">
                     <a:xfrm>
                       <a:off x="0" y="0"/>
-                      <a:ext cx="2378583" cy="5150981"/>
+                      <a:ext cx="2751954" cy="5959542"/>
                     </a:xfrm>
                     <a:prstGeom prst="rect">
                       <a:avLst/>
@@ -13513,12 +13524,93 @@
       <w:r>
         <w:br w:type="page"/>
       </w:r>
+      <w:r>
+        <w:lastRenderedPageBreak/>
+        <w:t>Available Ingredients Screen</w:t>
+      </w:r>
+    </w:p>
+    <w:p>
+      <w:r>
+        <w:t>The Available Ingredients screen allows users to manage ingredients currently available to them for use during personalised meal and recipe generation. Users can enter ingredients and add them to their available ingredient list, while previously added ingredients can be viewed and removed when they are no longer available.</w:t>
+      </w:r>
+    </w:p>
+    <w:p>
+      <w:r>
+        <w:t>A separate screen is used for ingredient management as the number of available ingredients may vary considerably between users and change frequently. This prevents the User Profile screen from becoming overcrowded while still providing users with direct control over their available ingredient information.</w:t>
+      </w:r>
+    </w:p>
+    <w:p>
+      <w:pPr>
+        <w:spacing w:after="160" w:line="259" w:lineRule="auto"/>
+        <w:rPr>
+          <w:rFonts w:asciiTheme="majorHAnsi" w:eastAsiaTheme="majorEastAsia" w:hAnsiTheme="majorHAnsi" w:cstheme="majorBidi"/>
+          <w:color w:val="0F4761" w:themeColor="accent1" w:themeShade="BF"/>
+          <w:sz w:val="32"/>
+          <w:szCs w:val="32"/>
+        </w:rPr>
+      </w:pPr>
+      <w:bookmarkStart w:id="59" w:name="_Toc237638877"/>
+      <w:r>
+        <w:rPr>
+          <w:noProof/>
+        </w:rPr>
+        <w:drawing>
+          <wp:inline distT="0" distB="0" distL="0" distR="0" wp14:anchorId="1E24D362" wp14:editId="029A43E1">
+            <wp:extent cx="2743200" cy="5940583"/>
+            <wp:effectExtent l="0" t="0" r="0" b="3175"/>
+            <wp:docPr id="373364799" name="Picture 1"/>
+            <wp:cNvGraphicFramePr>
+              <a:graphicFrameLocks xmlns:a="http://schemas.openxmlformats.org/drawingml/2006/main" noChangeAspect="1"/>
+            </wp:cNvGraphicFramePr>
+            <a:graphic xmlns:a="http://schemas.openxmlformats.org/drawingml/2006/main">
+              <a:graphicData uri="http://schemas.openxmlformats.org/drawingml/2006/picture">
+                <pic:pic xmlns:pic="http://schemas.openxmlformats.org/drawingml/2006/picture">
+                  <pic:nvPicPr>
+                    <pic:cNvPr id="0" name="Picture 1"/>
+                    <pic:cNvPicPr>
+                      <a:picLocks noChangeAspect="1" noChangeArrowheads="1"/>
+                    </pic:cNvPicPr>
+                  </pic:nvPicPr>
+                  <pic:blipFill>
+                    <a:blip r:embed="rId13">
+                      <a:extLst>
+                        <a:ext uri="{28A0092B-C50C-407E-A947-70E740481C1C}">
+                          <a14:useLocalDpi xmlns:a14="http://schemas.microsoft.com/office/drawing/2010/main" val="0"/>
+                        </a:ext>
+                      </a:extLst>
+                    </a:blip>
+                    <a:srcRect/>
+                    <a:stretch>
+                      <a:fillRect/>
+                    </a:stretch>
+                  </pic:blipFill>
+                  <pic:spPr bwMode="auto">
+                    <a:xfrm>
+                      <a:off x="0" y="0"/>
+                      <a:ext cx="2759075" cy="5974962"/>
+                    </a:xfrm>
+                    <a:prstGeom prst="rect">
+                      <a:avLst/>
+                    </a:prstGeom>
+                    <a:noFill/>
+                    <a:ln>
+                      <a:noFill/>
+                    </a:ln>
+                  </pic:spPr>
+                </pic:pic>
+              </a:graphicData>
+            </a:graphic>
+          </wp:inline>
+        </w:drawing>
+      </w:r>
+      <w:r>
+        <w:br w:type="page"/>
+      </w:r>
     </w:p>
     <w:p>
       <w:pPr>
         <w:pStyle w:val="Heading2"/>
       </w:pPr>
-      <w:bookmarkStart w:id="59" w:name="_Toc237638877"/>
       <w:r>
         <w:lastRenderedPageBreak/>
         <w:t>Database Design and Entity Relationship Diagram – Ansh</w:t>

</xml_diff>